<commit_message>
Feinschliff an Report und Präsentation vor der Abgabe
- Vergleichsmenge Blech 8 mm im Report vereinheitlicht (2.260,8 kg)
- Prozentangabe zum Vergabevorteil korrigiert (3,7 statt 3,8 Prozent),
  in Report Kap. 8 sowie Präsentation Folie 7 (Folie und Sprechernotiz)
- Präsentation Folie 9: Preisspiegel-Werte für Klöckner/Salzgitter bei
  Blech 15 mm von "–" auf "0,00 €" geändert, passend zur Sprechernotiz
- Präsentation Folie 13: Hinweis ergänzt, dass die vier Kennzahlen
  unterschiedliche Bezugsgrößen haben und nicht addierbar sind
- Präsentation Sprechernotizen: Vorgangsnummer auf AF-103134-2000
  vereinheitlicht (Folie 1 und 5)

Co-Authored-By: Claude Sonnet 5 <noreply@anthropic.com>
Claude-Session: https://claude.ai/code/session_011eo8Sh8s17fDiLfoEt1XnG
</commit_message>
<xml_diff>
--- a/report/Report_Fachaufgabe_METALLART.docx
+++ b/report/Report_Fachaufgabe_METALLART.docx
@@ -617,8 +617,6 @@
       <w:r>
         <w:tab/>
         <w:t>Auswertung der Materialanforderungen</w:t>
-      </w:r>
-      <w:r>
         <w:tab/>
         <w:t>1</w:t>
       </w:r>
@@ -642,8 +640,6 @@
       <w:r>
         <w:tab/>
         <w:t>Anfrage bei fünf Stahlhändlern</w:t>
-      </w:r>
-      <w:r>
         <w:tab/>
         <w:t>2</w:t>
       </w:r>
@@ -667,8 +663,6 @@
       <w:r>
         <w:tab/>
         <w:t>Angebotsvergleich auf Ausführung, Zeugnisart und Versandbedingungen</w:t>
-      </w:r>
-      <w:r>
         <w:tab/>
         <w:t>2</w:t>
       </w:r>
@@ -692,8 +686,6 @@
       <w:r>
         <w:tab/>
         <w:t>Vergabeentscheidung und Bestellung</w:t>
-      </w:r>
-      <w:r>
         <w:tab/>
         <w:t>3</w:t>
       </w:r>
@@ -717,8 +709,6 @@
       <w:r>
         <w:tab/>
         <w:t>Stornierung, Ersatzbeschaffung und Preisverhandlung</w:t>
-      </w:r>
-      <w:r>
         <w:tab/>
         <w:t>3</w:t>
       </w:r>
@@ -742,8 +732,6 @@
       <w:r>
         <w:tab/>
         <w:t>Kontrolle der Auftragsbestätigung</w:t>
-      </w:r>
-      <w:r>
         <w:tab/>
         <w:t>4</w:t>
       </w:r>
@@ -805,8 +793,6 @@
       <w:r>
         <w:tab/>
         <w:t>Wareneingang und Prüfung der Zeugnisse</w:t>
-      </w:r>
-      <w:r>
         <w:tab/>
         <w:t>4</w:t>
       </w:r>
@@ -830,8 +816,6 @@
       <w:r>
         <w:tab/>
         <w:t>Rechnungsprüfung</w:t>
-      </w:r>
-      <w:r>
         <w:tab/>
         <w:t>4</w:t>
       </w:r>
@@ -1884,7 +1868,7 @@
               <w:rPr>
                 <w:sz w:val="18"/>
               </w:rPr>
-              <w:t>Blech 8 mm GF · 8 Tafeln · 2.261 kg</w:t>
+              <w:t>Blech 8 mm GF · 8 Tafeln · 2.260,8 kg</w:t>
             </w:r>
           </w:p>
         </w:tc>
@@ -3139,31 +3123,13 @@
         <w:lastRenderedPageBreak/>
         <w:t>8  </w:t>
       </w:r>
-      <w:proofErr w:type="spellStart"/>
       <w:r>
         <w:rPr>
           <w:b/>
           <w:sz w:val="27"/>
         </w:rPr>
-        <w:t>Wirtschaftliche</w:t>
-      </w:r>
-      <w:proofErr w:type="spellEnd"/>
-      <w:r>
-        <w:rPr>
-          <w:b/>
-          <w:sz w:val="27"/>
-        </w:rPr>
-        <w:t xml:space="preserve"> </w:t>
-      </w:r>
-      <w:proofErr w:type="spellStart"/>
-      <w:r>
-        <w:rPr>
-          <w:b/>
-          <w:sz w:val="27"/>
-        </w:rPr>
-        <w:t>Bewertung</w:t>
-      </w:r>
-      <w:proofErr w:type="spellEnd"/>
+        <w:t xml:space="preserve">Wirtschaftliche Bewertung</w:t>
+      </w:r>
     </w:p>
     <w:p>
       <w:pPr>
@@ -3172,7 +3138,7 @@
         <w:jc w:val="both"/>
       </w:pPr>
       <w:r>
-        <w:t>Für die fünf Positionen an Klöckner weist der Preisspiegel auf die einheitliche Vergleichsmenge 9.451,87 Euro netto aus, 359,49 Euro oder 3,8 Prozent unter dem zweitgünstigsten und 703,89 Euro unter dem teuersten Anbieter.</w:t>
+        <w:t>Für die fünf Positionen an Klöckner weist der Preisspiegel auf die einheitliche Vergleichsmenge 9.451,87 Euro netto aus, 359,49 Euro oder 3,7 Prozent unter dem zweitgünstigsten und 703,89 Euro unter dem teuersten Anbieter.</w:t>
       </w:r>
     </w:p>
     <w:p>
@@ -3388,30 +3354,8 @@
               <w:rPr>
                 <w:sz w:val="18"/>
               </w:rPr>
-              <w:t xml:space="preserve">Blech 8 mm: </w:t>
+              <w:t xml:space="preserve">Blech 8 mm: Differenz = Ersparnis</w:t>
             </w:r>
-            <w:proofErr w:type="spellStart"/>
-            <w:r>
-              <w:rPr>
-                <w:sz w:val="18"/>
-              </w:rPr>
-              <w:t>Differenz</w:t>
-            </w:r>
-            <w:proofErr w:type="spellEnd"/>
-            <w:r>
-              <w:rPr>
-                <w:sz w:val="18"/>
-              </w:rPr>
-              <w:t xml:space="preserve"> = </w:t>
-            </w:r>
-            <w:proofErr w:type="spellStart"/>
-            <w:r>
-              <w:rPr>
-                <w:sz w:val="18"/>
-              </w:rPr>
-              <w:t>Ersparnis</w:t>
-            </w:r>
-            <w:proofErr w:type="spellEnd"/>
           </w:p>
         </w:tc>
         <w:tc>
@@ -3436,15 +3380,7 @@
                 <w:color w:val="00B050"/>
                 <w:sz w:val="18"/>
               </w:rPr>
-              <w:t>− 113,04</w:t>
-            </w:r>
-            <w:r>
-              <w:rPr>
-                <w:b/>
-                <w:color w:val="00B050"/>
-                <w:sz w:val="18"/>
-              </w:rPr>
-              <w:t xml:space="preserve"> EUR</w:t>
+              <w:t xml:space="preserve">− 113,04 EUR</w:t>
             </w:r>
           </w:p>
         </w:tc>
@@ -3467,33 +3403,8 @@
                 <w:b/>
                 <w:sz w:val="18"/>
               </w:rPr>
-              <w:t xml:space="preserve">Saldo </w:t>
+              <w:t xml:space="preserve">Saldo aus der Stornierung</w:t>
             </w:r>
-            <w:proofErr w:type="spellStart"/>
-            <w:r>
-              <w:rPr>
-                <w:b/>
-                <w:sz w:val="18"/>
-              </w:rPr>
-              <w:t>aus</w:t>
-            </w:r>
-            <w:proofErr w:type="spellEnd"/>
-            <w:r>
-              <w:rPr>
-                <w:b/>
-                <w:sz w:val="18"/>
-              </w:rPr>
-              <w:t xml:space="preserve"> der </w:t>
-            </w:r>
-            <w:proofErr w:type="spellStart"/>
-            <w:r>
-              <w:rPr>
-                <w:b/>
-                <w:sz w:val="18"/>
-              </w:rPr>
-              <w:t>Stornierung</w:t>
-            </w:r>
-            <w:proofErr w:type="spellEnd"/>
           </w:p>
         </w:tc>
         <w:tc>

</xml_diff>